<commit_message>
Manuscript in the authors' house style (from the earlier manuscript)
- build.py: US Letter, Times New Roman 10 pt, 1.5 spacing, justified, page number
  in footer; headings '1. Introduction' / '2.1 ...'; bold run-in 'Abstract.';
  author line with superscript affiliations; 'Figure N.' captions below figures,
  'Table N.' above three-line tables; numbered equations in borderless tables
- Author-year citations ('(Svendsen et al. 2023)', narrative 'Riboldi and Nord
  (2018)'), alphabetical reference list with hanging indent
- paper.md: front matter placeholders; Nomenclature and List of Acronyms after
  the Conclusions; declarations as separate sections in the template order
</commit_message>
<xml_diff>
--- a/docs/paper/highlights.docx
+++ b/docs/paper/highlights.docx
@@ -2,16 +2,22 @@
 <file path=word/document.xml><?xml version="1.0" encoding="utf-8"?>
 <w:document xmlns:w="http://schemas.openxmlformats.org/wordprocessingml/2006/main" xmlns:m="http://schemas.openxmlformats.org/officeDocument/2006/math" xmlns:r="http://schemas.openxmlformats.org/officeDocument/2006/relationships" xmlns:o="urn:schemas-microsoft-com:office:office" xmlns:v="urn:schemas-microsoft-com:vml" xmlns:w10="urn:schemas-microsoft-com:office:word" xmlns:a="http://schemas.openxmlformats.org/drawingml/2006/main" xmlns:pic="http://schemas.openxmlformats.org/drawingml/2006/picture" xmlns:wp="http://schemas.openxmlformats.org/drawingml/2006/wordprocessingDrawing">
   <w:body>
-    <w:bookmarkStart w:id="20" w:name="highlights"/>
     <w:p>
       <w:pPr>
-        <w:pStyle w:val="Heading1"/>
+        <w:pStyle w:val="Title"/>
       </w:pPr>
       <w:r>
         <w:t xml:space="preserve">Highlights</w:t>
       </w:r>
     </w:p>
     <w:p>
+      <w:r>
+        <w:pict>
+          <v:rect style="width:0;height:1.5pt" o:hralign="center" o:hrstd="t" o:hr="t"/>
+        </w:pict>
+      </w:r>
+    </w:p>
+    <w:p>
       <w:pPr>
         <w:numPr>
           <w:ilvl w:val="0"/>
@@ -71,14 +77,37 @@
         <w:t xml:space="preserve">Rules that keep two gas turbines online remove most of the gain</w:t>
       </w:r>
     </w:p>
-    <w:bookmarkEnd w:id="20"/>
-    <w:sectPr/>
+    <w:sectPr>
+      <w:footerReference r:id="rId9" w:type="default"/>
+      <w:pgSz w:h="15840" w:w="12240"/>
+      <w:pgMar w:bottom="1440" w:left="1440" w:right="1440" w:top="1440"/>
+    </w:sectPr>
   </w:body>
 </w:document>
 </file>
 
 <file path=word/comments.xml><?xml version="1.0" encoding="utf-8"?>
 <w:comments xmlns:w="http://schemas.openxmlformats.org/wordprocessingml/2006/main" xmlns:m="http://schemas.openxmlformats.org/officeDocument/2006/math" xmlns:r="http://schemas.openxmlformats.org/officeDocument/2006/relationships" xmlns:o="urn:schemas-microsoft-com:office:office" xmlns:v="urn:schemas-microsoft-com:vml" xmlns:w10="urn:schemas-microsoft-com:office:word" xmlns:a="http://schemas.openxmlformats.org/drawingml/2006/main" xmlns:pic="http://schemas.openxmlformats.org/drawingml/2006/picture" xmlns:wp="http://schemas.openxmlformats.org/drawingml/2006/wordprocessingDrawing"/>
+</file>
+
+<file path=word/footer1.xml><?xml version="1.0" encoding="utf-8"?>
+<w:ftr xmlns:m="http://schemas.openxmlformats.org/officeDocument/2006/math" xmlns:mc="http://schemas.openxmlformats.org/markup-compatibility/2006" xmlns:mo="http://schemas.microsoft.com/office/mac/office/2008/main" xmlns:mv="urn:schemas-microsoft-com:mac:vml" xmlns:o="urn:schemas-microsoft-com:office:office" xmlns:r="http://schemas.openxmlformats.org/officeDocument/2006/relationships" xmlns:v="urn:schemas-microsoft-com:vml" xmlns:w10="urn:schemas-microsoft-com:office:word" xmlns:w14="http://schemas.microsoft.com/office/word/2010/wordml" xmlns:w="http://schemas.openxmlformats.org/wordprocessingml/2006/main" xmlns:wne="http://schemas.microsoft.com/office/word/2006/wordml" xmlns:wp14="http://schemas.microsoft.com/office/word/2010/wordprocessingDrawing" xmlns:wp="http://schemas.openxmlformats.org/drawingml/2006/wordprocessingDrawing" xmlns:wpc="http://schemas.microsoft.com/office/word/2010/wordprocessingCanvas" xmlns:wpg="http://schemas.microsoft.com/office/word/2010/wordprocessingGroup" xmlns:wpi="http://schemas.microsoft.com/office/word/2010/wordprocessingInk" xmlns:wps="http://schemas.microsoft.com/office/word/2010/wordprocessingShape" mc:Ignorable="w14 wp14">
+  <w:p>
+    <w:pPr>
+      <w:pStyle w:val="Footer"/>
+      <w:jc w:val="center"/>
+    </w:pPr>
+    <w:r>
+      <w:fldChar w:fldCharType="begin"/>
+    </w:r>
+    <w:r>
+      <w:instrText xml:space="preserve"> PAGE </w:instrText>
+    </w:r>
+    <w:r>
+      <w:fldChar w:fldCharType="end"/>
+    </w:r>
+  </w:p>
+</w:ftr>
 </file>
 
 <file path=word/footnotes.xml><?xml version="1.0" encoding="utf-8"?>
@@ -284,29 +313,59 @@
   <w:style w:default="1" w:styleId="Normal" w:type="paragraph">
     <w:name w:val="Normal"/>
     <w:qFormat/>
+    <w:pPr>
+      <w:spacing w:after="120" w:before="0" w:line="360" w:lineRule="auto"/>
+      <w:jc w:val="both"/>
+    </w:pPr>
+    <w:rPr>
+      <w:rFonts w:ascii="Times New Roman" w:cs="Times New Roman" w:eastAsia="Times New Roman" w:hAnsi="Times New Roman"/>
+      <w:color w:val="000000"/>
+      <w:sz w:val="20"/>
+    </w:rPr>
   </w:style>
   <w:style w:styleId="BodyText" w:type="paragraph">
     <w:name w:val="Body Text"/>
     <w:basedOn w:val="Normal"/>
     <w:link w:val="BodyTextChar"/>
     <w:pPr>
-      <w:spacing w:after="180" w:before="180"/>
-    </w:pPr>
-    <w:qFormat/>
+      <w:spacing w:after="120" w:before="0" w:line="360" w:lineRule="auto"/>
+      <w:jc w:val="both"/>
+    </w:pPr>
+    <w:qFormat/>
+    <w:rPr>
+      <w:rFonts w:ascii="Times New Roman" w:cs="Times New Roman" w:eastAsia="Times New Roman" w:hAnsi="Times New Roman"/>
+      <w:color w:val="000000"/>
+      <w:sz w:val="20"/>
+    </w:rPr>
   </w:style>
   <w:style w:customStyle="1" w:styleId="FirstParagraph" w:type="paragraph">
     <w:name w:val="First Paragraph"/>
     <w:basedOn w:val="BodyText"/>
     <w:next w:val="BodyText"/>
     <w:qFormat/>
+    <w:pPr>
+      <w:spacing w:after="120" w:before="0" w:line="360" w:lineRule="auto"/>
+      <w:jc w:val="both"/>
+    </w:pPr>
+    <w:rPr>
+      <w:rFonts w:ascii="Times New Roman" w:cs="Times New Roman" w:eastAsia="Times New Roman" w:hAnsi="Times New Roman"/>
+      <w:color w:val="000000"/>
+      <w:sz w:val="20"/>
+    </w:rPr>
   </w:style>
   <w:style w:customStyle="1" w:styleId="Compact" w:type="paragraph">
     <w:name w:val="Compact"/>
     <w:basedOn w:val="BodyText"/>
     <w:qFormat/>
     <w:pPr>
-      <w:spacing w:after="36" w:before="36"/>
-    </w:pPr>
+      <w:spacing w:after="40" w:before="0" w:line="360" w:lineRule="auto"/>
+      <w:jc w:val="both"/>
+    </w:pPr>
+    <w:rPr>
+      <w:rFonts w:ascii="Times New Roman" w:cs="Times New Roman" w:eastAsia="Times New Roman" w:hAnsi="Times New Roman"/>
+      <w:color w:val="000000"/>
+      <w:sz w:val="20"/>
+    </w:rPr>
   </w:style>
   <w:style w:styleId="Title" w:type="paragraph">
     <w:name w:val="Title"/>
@@ -316,15 +375,15 @@
     <w:pPr>
       <w:keepNext/>
       <w:keepLines/>
-      <w:spacing w:after="240" w:before="480"/>
-      <w:jc w:val="center"/>
-    </w:pPr>
-    <w:rPr>
-      <w:rFonts w:asciiTheme="majorHAnsi" w:cstheme="majorBidi" w:eastAsiaTheme="majorEastAsia" w:hAnsiTheme="majorHAnsi"/>
+      <w:spacing w:after="240" w:before="0" w:line="360" w:lineRule="auto"/>
+      <w:jc w:val="left"/>
+    </w:pPr>
+    <w:rPr>
+      <w:rFonts w:ascii="Times New Roman" w:cs="Times New Roman" w:eastAsia="Times New Roman" w:hAnsi="Times New Roman"/>
       <w:b/>
       <w:bCs/>
-      <w:color w:themeColor="accent1" w:themeShade="B5" w:val="345A8A"/>
-      <w:sz w:val="36"/>
+      <w:color w:val="000000"/>
+      <w:sz w:val="20"/>
       <w:szCs w:val="36"/>
     </w:rPr>
   </w:style>
@@ -351,8 +410,14 @@
     <w:pPr>
       <w:keepNext/>
       <w:keepLines/>
-      <w:jc w:val="center"/>
-    </w:pPr>
+      <w:spacing w:after="120" w:before="120" w:line="360" w:lineRule="auto"/>
+      <w:jc w:val="left"/>
+    </w:pPr>
+    <w:rPr>
+      <w:rFonts w:ascii="Times New Roman" w:cs="Times New Roman" w:eastAsia="Times New Roman" w:hAnsi="Times New Roman"/>
+      <w:color w:val="000000"/>
+      <w:sz w:val="20"/>
+    </w:rPr>
   </w:style>
   <w:style w:styleId="Date" w:type="paragraph">
     <w:name w:val="Date"/>
@@ -363,6 +428,11 @@
       <w:keepLines/>
       <w:jc w:val="center"/>
     </w:pPr>
+    <w:rPr>
+      <w:rFonts w:ascii="Times New Roman" w:cs="Times New Roman" w:eastAsia="Times New Roman" w:hAnsi="Times New Roman"/>
+      <w:color w:val="000000"/>
+      <w:sz w:val="20"/>
+    </w:rPr>
   </w:style>
   <w:style w:customStyle="1" w:styleId="AbstractTitle" w:type="paragraph">
     <w:name w:val="Abstract Title"/>
@@ -394,6 +464,8 @@
       <w:spacing w:after="300" w:before="100"/>
     </w:pPr>
     <w:rPr>
+      <w:rFonts w:ascii="Times New Roman" w:cs="Times New Roman" w:eastAsia="Times New Roman" w:hAnsi="Times New Roman"/>
+      <w:color w:val="000000"/>
       <w:sz w:val="20"/>
       <w:szCs w:val="20"/>
     </w:rPr>
@@ -403,8 +475,16 @@
     <w:basedOn w:val="Normal"/>
     <w:next w:val="Bibliography"/>
     <w:qFormat/>
-    <w:pPr/>
-    <w:rPr/>
+    <w:pPr>
+      <w:spacing w:after="80" w:before="0" w:line="360" w:lineRule="auto"/>
+      <w:ind w:hanging="454" w:left="454"/>
+      <w:jc w:val="left"/>
+    </w:pPr>
+    <w:rPr>
+      <w:rFonts w:ascii="Times New Roman" w:cs="Times New Roman" w:eastAsia="Times New Roman" w:hAnsi="Times New Roman"/>
+      <w:color w:val="000000"/>
+      <w:sz w:val="20"/>
+    </w:rPr>
   </w:style>
   <w:style w:styleId="Heading1" w:type="paragraph">
     <w:name w:val="Heading 1"/>
@@ -415,15 +495,17 @@
     <w:pPr>
       <w:keepNext/>
       <w:keepLines/>
-      <w:spacing w:after="0" w:before="480"/>
+      <w:spacing w:after="120" w:before="280" w:line="360" w:lineRule="auto"/>
+      <w:jc w:val="left"/>
       <w:outlineLvl w:val="0"/>
     </w:pPr>
     <w:rPr>
-      <w:rFonts w:asciiTheme="majorHAnsi" w:cstheme="majorBidi" w:eastAsiaTheme="majorEastAsia" w:hAnsiTheme="majorHAnsi"/>
+      <w:rFonts w:ascii="Times New Roman" w:cs="Times New Roman" w:eastAsia="Times New Roman" w:hAnsi="Times New Roman"/>
       <w:b/>
       <w:bCs/>
-      <w:color w:themeColor="accent1" w:val="4F81BD"/>
-      <w:sz w:val="32"/>
+      <w:i w:val="0"/>
+      <w:color w:val="000000"/>
+      <w:sz w:val="20"/>
       <w:szCs w:val="32"/>
     </w:rPr>
   </w:style>
@@ -437,15 +519,17 @@
     <w:pPr>
       <w:keepNext/>
       <w:keepLines/>
-      <w:spacing w:after="0" w:before="200"/>
+      <w:spacing w:after="120" w:before="200" w:line="360" w:lineRule="auto"/>
+      <w:jc w:val="left"/>
       <w:outlineLvl w:val="1"/>
     </w:pPr>
     <w:rPr>
-      <w:rFonts w:asciiTheme="majorHAnsi" w:cstheme="majorBidi" w:eastAsiaTheme="majorEastAsia" w:hAnsiTheme="majorHAnsi"/>
+      <w:rFonts w:ascii="Times New Roman" w:cs="Times New Roman" w:eastAsia="Times New Roman" w:hAnsi="Times New Roman"/>
       <w:b/>
       <w:bCs/>
-      <w:color w:themeColor="accent1" w:val="4F81BD"/>
-      <w:sz w:val="28"/>
+      <w:i w:val="0"/>
+      <w:color w:val="000000"/>
+      <w:sz w:val="20"/>
       <w:szCs w:val="28"/>
     </w:rPr>
   </w:style>
@@ -459,15 +543,17 @@
     <w:pPr>
       <w:keepNext/>
       <w:keepLines/>
-      <w:spacing w:after="0" w:before="200"/>
+      <w:spacing w:after="120" w:before="160" w:line="360" w:lineRule="auto"/>
+      <w:jc w:val="left"/>
       <w:outlineLvl w:val="2"/>
     </w:pPr>
     <w:rPr>
-      <w:rFonts w:asciiTheme="majorHAnsi" w:cstheme="majorBidi" w:eastAsiaTheme="majorEastAsia" w:hAnsiTheme="majorHAnsi"/>
+      <w:rFonts w:ascii="Times New Roman" w:cs="Times New Roman" w:eastAsia="Times New Roman" w:hAnsi="Times New Roman"/>
       <w:b/>
       <w:bCs/>
-      <w:color w:themeColor="accent1" w:val="4F81BD"/>
-      <w:sz w:val="24"/>
+      <w:i w:val="0"/>
+      <w:color w:val="000000"/>
+      <w:sz w:val="20"/>
       <w:szCs w:val="24"/>
     </w:rPr>
   </w:style>
@@ -602,9 +688,15 @@
     <w:unhideWhenUsed/>
     <w:qFormat/>
     <w:pPr>
-      <w:spacing w:after="100" w:before="100"/>
-      <w:ind w:firstLine="0" w:left="480" w:right="480"/>
-    </w:pPr>
+      <w:spacing w:after="120" w:before="0" w:line="360" w:lineRule="auto"/>
+      <w:ind w:left="480" w:right="480"/>
+      <w:jc w:val="both"/>
+    </w:pPr>
+    <w:rPr>
+      <w:rFonts w:ascii="Times New Roman" w:cs="Times New Roman" w:eastAsia="Times New Roman" w:hAnsi="Times New Roman"/>
+      <w:color w:val="000000"/>
+      <w:sz w:val="20"/>
+    </w:rPr>
   </w:style>
   <w:style w:styleId="FootnoteText" w:type="paragraph">
     <w:name w:val="Footnote Text"/>
@@ -613,6 +705,11 @@
     <w:uiPriority w:val="9"/>
     <w:unhideWhenUsed/>
     <w:qFormat/>
+    <w:rPr>
+      <w:rFonts w:ascii="Times New Roman" w:cs="Times New Roman" w:eastAsia="Times New Roman" w:hAnsi="Times New Roman"/>
+      <w:color w:val="000000"/>
+      <w:sz w:val="20"/>
+    </w:rPr>
   </w:style>
   <w:style w:default="1" w:styleId="DefaultParagraphFont" w:type="character">
     <w:name w:val="Default Paragraph Font"/>
@@ -625,6 +722,11 @@
     <w:semiHidden/>
     <w:unhideWhenUsed/>
     <w:qFormat/>
+    <w:rPr>
+      <w:rFonts w:ascii="Times New Roman" w:cs="Times New Roman" w:eastAsia="Times New Roman" w:hAnsi="Times New Roman"/>
+      <w:color w:val="000000"/>
+      <w:sz w:val="20"/>
+    </w:rPr>
     <w:tblPr>
       <w:tblInd w:type="dxa" w:w="0"/>
       <w:tblCellMar>
@@ -684,14 +786,34 @@
     <w:pPr>
       <w:keepNext/>
     </w:pPr>
+    <w:rPr>
+      <w:rFonts w:ascii="Times New Roman" w:cs="Times New Roman" w:eastAsia="Times New Roman" w:hAnsi="Times New Roman"/>
+      <w:color w:val="000000"/>
+      <w:sz w:val="20"/>
+    </w:rPr>
   </w:style>
   <w:style w:customStyle="1" w:styleId="ImageCaption" w:type="paragraph">
     <w:name w:val="Image Caption"/>
     <w:basedOn w:val="Caption"/>
+    <w:rPr>
+      <w:rFonts w:ascii="Times New Roman" w:cs="Times New Roman" w:eastAsia="Times New Roman" w:hAnsi="Times New Roman"/>
+      <w:color w:val="000000"/>
+      <w:sz w:val="20"/>
+    </w:rPr>
   </w:style>
   <w:style w:customStyle="1" w:styleId="Figure" w:type="paragraph">
     <w:name w:val="Figure"/>
     <w:basedOn w:val="Normal"/>
+    <w:pPr>
+      <w:keepNext/>
+      <w:spacing w:after="0" w:before="120" w:line="240" w:lineRule="auto"/>
+      <w:jc w:val="center"/>
+    </w:pPr>
+    <w:rPr>
+      <w:rFonts w:ascii="Times New Roman" w:cs="Times New Roman" w:eastAsia="Times New Roman" w:hAnsi="Times New Roman"/>
+      <w:color w:val="000000"/>
+      <w:sz w:val="20"/>
+    </w:rPr>
   </w:style>
   <w:style w:customStyle="1" w:styleId="CaptionedFigure" w:type="paragraph">
     <w:name w:val="Captioned Figure"/>
@@ -699,6 +821,11 @@
     <w:pPr>
       <w:keepNext/>
     </w:pPr>
+    <w:rPr>
+      <w:rFonts w:ascii="Times New Roman" w:cs="Times New Roman" w:eastAsia="Times New Roman" w:hAnsi="Times New Roman"/>
+      <w:color w:val="000000"/>
+      <w:sz w:val="20"/>
+    </w:rPr>
   </w:style>
   <w:style w:customStyle="1" w:styleId="BodyTextChar" w:type="character">
     <w:name w:val="Body Text Char"/>
@@ -728,7 +855,8 @@
     <w:name w:val="Hyperlink"/>
     <w:basedOn w:val="BodyTextChar"/>
     <w:rPr>
-      <w:color w:themeColor="accent1" w:val="4F81BD"/>
+      <w:color w:val="000000"/>
+      <w:u w:val="none"/>
     </w:rPr>
   </w:style>
   <w:style w:styleId="TOCHeading" w:type="paragraph">
@@ -747,6 +875,33 @@
       <w:b w:val="0"/>
       <w:bCs w:val="0"/>
       <w:color w:themeColor="accent1" w:themeShade="BF" w:val="365F91"/>
+    </w:rPr>
+  </w:style>
+  <w:style w:customStyle="1" w:styleId="Affiliation" w:type="paragraph">
+    <w:name w:val="Affiliation"/>
+    <w:basedOn w:val="Normal"/>
+    <w:pPr>
+      <w:spacing w:after="80" w:before="0" w:line="360" w:lineRule="auto"/>
+      <w:jc w:val="left"/>
+    </w:pPr>
+    <w:rPr>
+      <w:rFonts w:ascii="Times New Roman" w:cs="Times New Roman" w:eastAsia="Times New Roman" w:hAnsi="Times New Roman"/>
+      <w:i/>
+      <w:color w:val="000000"/>
+      <w:sz w:val="20"/>
+    </w:rPr>
+  </w:style>
+  <w:style w:customStyle="1" w:styleId="FigureCaption" w:type="paragraph">
+    <w:name w:val="Figure Caption"/>
+    <w:basedOn w:val="Normal"/>
+    <w:pPr>
+      <w:spacing w:after="200" w:before="80" w:line="360" w:lineRule="auto"/>
+      <w:jc w:val="both"/>
+    </w:pPr>
+    <w:rPr>
+      <w:rFonts w:ascii="Times New Roman" w:cs="Times New Roman" w:eastAsia="Times New Roman" w:hAnsi="Times New Roman"/>
+      <w:color w:val="000000"/>
+      <w:sz w:val="20"/>
     </w:rPr>
   </w:style>
   <w:style w:type="paragraph" w:customStyle="1" w:styleId="SourceCode">

</xml_diff>

<commit_message>
Adopt the author's edited version: names, affiliation, title, CO2 subscripts, full-width tables
* front matter from the author's Word version (author, affiliation, e-mail,
  'top-side' in the title); the Word file is kept in docs/paper/received/
* CO2 as CO~2~ (subscript) in all running text, outside equations
* tables span the text width with columns sized to their content
* word count treats CO~2~ as one word
</commit_message>
<xml_diff>
--- a/docs/paper/highlights.docx
+++ b/docs/paper/highlights.docx
@@ -38,7 +38,19 @@
         <w:pStyle w:val="Compact"/>
       </w:pPr>
       <w:r>
-        <w:t xml:space="preserve">Deferring water injection cuts CO2 a further 11 % with no lost production</w:t>
+        <w:t xml:space="preserve">Deferring water injection cuts CO</w:t>
+      </w:r>
+      <w:r>
+        <w:rPr>
+          <w:vertAlign w:val="subscript"/>
+        </w:rPr>
+        <w:t xml:space="preserve">2</w:t>
+      </w:r>
+      <w:r>
+        <w:t xml:space="preserve"> </w:t>
+      </w:r>
+      <w:r>
+        <w:t xml:space="preserve">a further 11 % with no lost production</w:t>
       </w:r>
     </w:p>
     <w:p>

</xml_diff>

<commit_message>
Forecast results, new abstract, conclusions, highlights and AJSE cover letter
* persistence forecast with a valued injection deficit keeps 94 % of the
  saving; with the strict end-of-plan rule only 7 % (Table 4, Section 3.4)
* abstract and conclusions report the 58/42 split, the GT-margin rule,
  forecast and reserve results; highlights updated
* cover letter addressed to the Arabian Journal for Science and Engineering,
  with the narrowed gap statement
</commit_message>
<xml_diff>
--- a/docs/paper/highlights.docx
+++ b/docs/paper/highlights.docx
@@ -62,7 +62,7 @@
         <w:pStyle w:val="Compact"/>
       </w:pPr>
       <w:r>
-        <w:t xml:space="preserve">The saving comes from avoiding a second gas turbine, not from shedding output</w:t>
+        <w:t xml:space="preserve">58 % of the saving comes from avoiding a second running gas turbine</w:t>
       </w:r>
     </w:p>
     <w:p>
@@ -74,7 +74,7 @@
         <w:pStyle w:val="Compact"/>
       </w:pPr>
       <w:r>
-        <w:t xml:space="preserve">About 24 h of deferrable injection captures the full benefit</w:t>
+        <w:t xml:space="preserve">The benefit doubles once demand exceeds one turbine’s rating minus reserve</w:t>
       </w:r>
     </w:p>
     <w:p>
@@ -86,7 +86,7 @@
         <w:pStyle w:val="Compact"/>
       </w:pPr>
       <w:r>
-        <w:t xml:space="preserve">Rules that keep two gas turbines online remove most of the gain</w:t>
+        <w:t xml:space="preserve">A persistence wind forecast keeps 94 % of the saving</w:t>
       </w:r>
     </w:p>
     <w:sectPr>

</xml_diff>